<commit_message>
Actualizar capturas reales de QA y Produccion en entrega final
</commit_message>
<xml_diff>
--- a/entrega/Evidencias_EntregaFinal_Mercado_Nube.docx
+++ b/entrega/Evidencias_EntregaFinal_Mercado_Nube.docx
@@ -1334,7 +1334,7 @@
                 <w:sz w:val="21"/>
                 <w:szCs w:val="21"/>
               </w:rPr>
-              <w:t>Misma QA del Avance 2: i-06f5d7a26aa4f1498. Vista de la salida real de SSM y datos de la API AWS; no se presenta como captura de la consola.</w:t>
+              <w:t>Consola EC2 de QA, la misma instancia del Avance 2: i-06f5d7a26aa4f1498. Estado: En ejecución. IP pública: 3.93.143.140. El ARN identifica la región us-east-1.</w:t>
             </w:r>
           </w:p>
           <w:p>
@@ -1356,8 +1356,8 @@
             <w:r>
               <w:drawing>
                 <wp:inline xmlns:a="http://schemas.openxmlformats.org/drawingml/2006/main" xmlns:pic="http://schemas.openxmlformats.org/drawingml/2006/picture">
-                  <wp:extent cx="5623560" cy="4451985"/>
-                  <wp:docPr id="5" name="Picture 5" descr="Misma QA del Avance 2: i-06f5d7a26aa4f1498. Vista de la salida real de SSM y datos de la API AWS; no se presenta como captura de la consola."/>
+                  <wp:extent cx="5623560" cy="1748416"/>
+                  <wp:docPr id="5" name="Picture 5" descr="Consola EC2 de QA, la misma instancia del Avance 2: i-06f5d7a26aa4f1498. Estado: En ejecución. IP pública: 3.93.143.140. El ARN identifica la región us-east-1."/>
                   <wp:cNvGraphicFramePr>
                     <a:graphicFrameLocks noChangeAspect="1"/>
                   </wp:cNvGraphicFramePr>
@@ -1377,7 +1377,7 @@
                         <pic:spPr>
                           <a:xfrm>
                             <a:off x="0" y="0"/>
-                            <a:ext cx="5623560" cy="4451985"/>
+                            <a:ext cx="5623560" cy="1748416"/>
                           </a:xfrm>
                           <a:prstGeom prst="rect"/>
                         </pic:spPr>
@@ -1497,7 +1497,7 @@
                 <w:sz w:val="21"/>
                 <w:szCs w:val="21"/>
               </w:rPr>
-              <w:t>Captura de la consola EC2 aportada por el alumno: instancia nueva i-02be4a02d659f23c3, en ejecución, IP 52.87.249.158. La imagen se tomó durante su inicialización; las pruebas posteriores acreditan la aplicación desplegada.</w:t>
+              <w:t>Consola EC2 de Producción: entrega-final-marketplace-production, instancia nueva i-02be4a02d659f23c3. Estado: En ejecución. IP pública: 52.87.249.158. Captura aportada por el alumno.</w:t>
             </w:r>
           </w:p>
           <w:p>
@@ -1519,8 +1519,8 @@
             <w:r>
               <w:drawing>
                 <wp:inline xmlns:a="http://schemas.openxmlformats.org/drawingml/2006/main" xmlns:pic="http://schemas.openxmlformats.org/drawingml/2006/picture">
-                  <wp:extent cx="5623560" cy="167650"/>
-                  <wp:docPr id="6" name="Picture 6" descr="Captura de la consola EC2 aportada por el alumno: instancia nueva i-02be4a02d659f23c3, en ejecución, IP 52.87.249.158. La imagen se tomó durante su inicialización; las pruebas posteriores acreditan la aplicación desplegada."/>
+                  <wp:extent cx="5623560" cy="2525762"/>
+                  <wp:docPr id="6" name="Picture 6" descr="Consola EC2 de Producción: entrega-final-marketplace-production, instancia nueva i-02be4a02d659f23c3. Estado: En ejecución. IP pública: 52.87.249.158. Captura aportada por el alumno."/>
                   <wp:cNvGraphicFramePr>
                     <a:graphicFrameLocks noChangeAspect="1"/>
                   </wp:cNvGraphicFramePr>
@@ -1540,7 +1540,7 @@
                         <pic:spPr>
                           <a:xfrm>
                             <a:off x="0" y="0"/>
-                            <a:ext cx="5623560" cy="167650"/>
+                            <a:ext cx="5623560" cy="2525762"/>
                           </a:xfrm>
                           <a:prstGeom prst="rect"/>
                         </pic:spPr>

</xml_diff>

<commit_message>
Incorporar capturas reales del pipeline en evidencias finales
</commit_message>
<xml_diff>
--- a/entrega/Evidencias_EntregaFinal_Mercado_Nube.docx
+++ b/entrega/Evidencias_EntregaFinal_Mercado_Nube.docx
@@ -678,7 +678,7 @@
                 <w:sz w:val="21"/>
                 <w:szCs w:val="21"/>
               </w:rPr>
-              <w:t>Corrida de QA con ocho etapas. Pytest detectó el acceso ajeno y anónimo: 2 fallidas, 18 aprobadas. BLOQUEAR, salida 1. Registro completo: reportes/pipeline_bloqueado.txt.</w:t>
+              <w:t>Terminal de la instancia QA i-06f5d7a26aa4f1498. Consulta del registro original: ocho etapas, 2 pruebas fallidas y 18 aprobadas; BLOQUEAR, salida 1. Registro completo: reportes/pipeline_bloqueado.txt.</w:t>
             </w:r>
           </w:p>
           <w:p>
@@ -700,8 +700,8 @@
             <w:r>
               <w:drawing>
                 <wp:inline xmlns:a="http://schemas.openxmlformats.org/drawingml/2006/main" xmlns:pic="http://schemas.openxmlformats.org/drawingml/2006/picture">
-                  <wp:extent cx="5623560" cy="4451985"/>
-                  <wp:docPr id="1" name="Picture 1" descr="Corrida de QA con ocho etapas. Pytest detectó el acceso ajeno y anónimo: 2 fallidas, 18 aprobadas. BLOQUEAR, salida 1. Registro completo: reportes/pipeline_bloqueado.txt."/>
+                  <wp:extent cx="5623560" cy="1969835"/>
+                  <wp:docPr id="1" name="Picture 1" descr="Terminal de la instancia QA i-06f5d7a26aa4f1498. Consulta del registro original: ocho etapas, 2 pruebas fallidas y 18 aprobadas; BLOQUEAR, salida 1. Registro completo: reportes/pipeline_bloqueado.txt."/>
                   <wp:cNvGraphicFramePr>
                     <a:graphicFrameLocks noChangeAspect="1"/>
                   </wp:cNvGraphicFramePr>
@@ -721,7 +721,76 @@
                         <pic:spPr>
                           <a:xfrm>
                             <a:off x="0" y="0"/>
-                            <a:ext cx="5623560" cy="4451985"/>
+                            <a:ext cx="5623560" cy="1969835"/>
+                          </a:xfrm>
+                          <a:prstGeom prst="rect"/>
+                        </pic:spPr>
+                      </pic:pic>
+                    </a:graphicData>
+                  </a:graphic>
+                </wp:inline>
+              </w:drawing>
+            </w:r>
+          </w:p>
+          <w:p>
+            <w:pPr>
+              <w:spacing w:after="80"/>
+            </w:pPr>
+            <w:r>
+              <w:rPr>
+                <w:rFonts w:ascii="Calibri" w:cs="Calibri" w:eastAsia="Calibri" w:hAnsi="Calibri"/>
+                <w:b/>
+                <w:bCs/>
+                <w:i w:val="0"/>
+                <w:color w:val="000000"/>
+                <w:sz w:val="21"/>
+                <w:szCs w:val="21"/>
+              </w:rPr>
+              <w:t>Detalle ampliado de las etapas y el veredicto de la misma captura</w:t>
+            </w:r>
+          </w:p>
+          <w:p>
+            <w:pPr>
+              <w:spacing w:after="0" w:line="264"/>
+            </w:pPr>
+            <w:r>
+              <w:rPr>
+                <w:rFonts w:ascii="Calibri" w:cs="Calibri" w:eastAsia="Calibri" w:hAnsi="Calibri"/>
+                <w:b w:val="false"/>
+                <w:bCs w:val="false"/>
+                <w:i w:val="false"/>
+                <w:iCs w:val="false"/>
+                <w:color w:val="4A4A4A"/>
+                <w:sz w:val="20"/>
+                <w:szCs w:val="20"/>
+              </w:rPr>
+            </w:r>
+            <w:r>
+              <w:drawing>
+                <wp:inline xmlns:a="http://schemas.openxmlformats.org/drawingml/2006/main" xmlns:pic="http://schemas.openxmlformats.org/drawingml/2006/picture">
+                  <wp:extent cx="5623560" cy="2587822"/>
+                  <wp:docPr id="8" name="Picture 1" descr="Detalle ampliado de las etapas y el veredicto de la misma captura original."/>
+                  <wp:cNvGraphicFramePr>
+                    <a:graphicFrameLocks noChangeAspect="1"/>
+                  </wp:cNvGraphicFramePr>
+                  <a:graphic>
+                    <a:graphicData uri="http://schemas.openxmlformats.org/drawingml/2006/picture">
+                      <pic:pic>
+                        <pic:nvPicPr>
+                          <pic:cNvPr id="0" name="01_pipeline_bloqueado.png"/>
+                          <pic:cNvPicPr/>
+                        </pic:nvPicPr>
+                        <pic:blipFill>
+                          <a:blip r:embed="rId10"/>
+                          <a:srcRect l="0" t="20000" r="49000" b="13000"/>
+                          <a:stretch>
+                            <a:fillRect/>
+                          </a:stretch>
+                        </pic:blipFill>
+                        <pic:spPr>
+                          <a:xfrm>
+                            <a:off x="0" y="0"/>
+                            <a:ext cx="5623560" cy="2587822"/>
                           </a:xfrm>
                           <a:prstGeom prst="rect"/>
                         </pic:spPr>
@@ -842,7 +911,7 @@
                 <w:sz w:val="21"/>
                 <w:szCs w:val="21"/>
               </w:rPr>
-              <w:t>Salida real de pytest en QA. Con CSRF válido, el parche original respondía HTTP 200 y llamaba al envío sin comprobar permisos. No es un hallazgo de Bandit.</w:t>
+              <w:t>Salida original de pytest consultada en la terminal de QA. El parche respondió HTTP 200 al usuario ajeno y al visitante; se esperaba 404 y 401, sin envío. Registro: reportes/final/roja/tests.log.</w:t>
             </w:r>
           </w:p>
           <w:p>
@@ -864,8 +933,8 @@
             <w:r>
               <w:drawing>
                 <wp:inline xmlns:a="http://schemas.openxmlformats.org/drawingml/2006/main" xmlns:pic="http://schemas.openxmlformats.org/drawingml/2006/picture">
-                  <wp:extent cx="5115207" cy="5166359"/>
-                  <wp:docPr id="2" name="Picture 2" descr="Salida real de pytest en QA. Con CSRF válido, el parche original respondía HTTP 200 y llamaba al envío sin comprobar permisos. No es un hallazgo de Bandit."/>
+                  <wp:extent cx="5623560" cy="4353724"/>
+                  <wp:docPr id="2" name="Picture 2" descr="Salida original de pytest consultada en la terminal de QA. El parche respondió HTTP 200 al usuario ajeno y al visitante; se esperaba 404 y 401, sin envío. Registro: reportes/final/roja/tests.log."/>
                   <wp:cNvGraphicFramePr>
                     <a:graphicFrameLocks noChangeAspect="1"/>
                   </wp:cNvGraphicFramePr>
@@ -885,7 +954,7 @@
                         <pic:spPr>
                           <a:xfrm>
                             <a:off x="0" y="0"/>
-                            <a:ext cx="5115207" cy="5166359"/>
+                            <a:ext cx="5623560" cy="4353724"/>
                           </a:xfrm>
                           <a:prstGeom prst="rect"/>
                         </pic:spPr>
@@ -1170,7 +1239,7 @@
                 <w:sz w:val="21"/>
                 <w:szCs w:val="21"/>
               </w:rPr>
-              <w:t>Pipeline completo sobre la remediación en QA: 23 pruebas aprobadas y ocho etapas en verde. PERMITIR, salida 0. Registro completo: reportes/pipeline_verde.txt.</w:t>
+              <w:t>Consulta del registro original de la corrida verde en QA: 23 pruebas aprobadas, ocho etapas PASS y PERMITIR, salida 0. Arriba permanece texto de la consulta roja anterior; el color rojo es resaltado de grep. Registro completo: reportes/pipeline_verde.txt.</w:t>
             </w:r>
           </w:p>
           <w:p>
@@ -1192,8 +1261,8 @@
             <w:r>
               <w:drawing>
                 <wp:inline xmlns:a="http://schemas.openxmlformats.org/drawingml/2006/main" xmlns:pic="http://schemas.openxmlformats.org/drawingml/2006/picture">
-                  <wp:extent cx="5623560" cy="4451985"/>
-                  <wp:docPr id="4" name="Picture 4" descr="Pipeline completo sobre la remediación en QA: 23 pruebas aprobadas y ocho etapas en verde. PERMITIR, salida 0. Registro completo: reportes/pipeline_verde.txt."/>
+                  <wp:extent cx="5623560" cy="2328583"/>
+                  <wp:docPr id="4" name="Picture 4" descr="Consulta del registro original de la corrida verde en QA: 23 pruebas aprobadas, ocho etapas PASS y PERMITIR, salida 0. Arriba permanece texto de la consulta roja anterior; el color rojo es resaltado de grep. Registro completo: reportes/pipeline_verde.txt."/>
                   <wp:cNvGraphicFramePr>
                     <a:graphicFrameLocks noChangeAspect="1"/>
                   </wp:cNvGraphicFramePr>
@@ -1213,7 +1282,76 @@
                         <pic:spPr>
                           <a:xfrm>
                             <a:off x="0" y="0"/>
-                            <a:ext cx="5623560" cy="4451985"/>
+                            <a:ext cx="5623560" cy="2328583"/>
+                          </a:xfrm>
+                          <a:prstGeom prst="rect"/>
+                        </pic:spPr>
+                      </pic:pic>
+                    </a:graphicData>
+                  </a:graphic>
+                </wp:inline>
+              </w:drawing>
+            </w:r>
+          </w:p>
+          <w:p>
+            <w:pPr>
+              <w:spacing w:after="80"/>
+            </w:pPr>
+            <w:r>
+              <w:rPr>
+                <w:rFonts w:ascii="Calibri" w:cs="Calibri" w:eastAsia="Calibri" w:hAnsi="Calibri"/>
+                <w:b/>
+                <w:bCs/>
+                <w:i w:val="0"/>
+                <w:color w:val="000000"/>
+                <w:sz w:val="21"/>
+                <w:szCs w:val="21"/>
+              </w:rPr>
+              <w:t>Detalle ampliado de las etapas y el veredicto de la misma captura</w:t>
+            </w:r>
+          </w:p>
+          <w:p>
+            <w:pPr>
+              <w:spacing w:after="0" w:line="264"/>
+            </w:pPr>
+            <w:r>
+              <w:rPr>
+                <w:rFonts w:ascii="Calibri" w:cs="Calibri" w:eastAsia="Calibri" w:hAnsi="Calibri"/>
+                <w:b w:val="false"/>
+                <w:bCs w:val="false"/>
+                <w:i w:val="false"/>
+                <w:iCs w:val="false"/>
+                <w:color w:val="4A4A4A"/>
+                <w:sz w:val="20"/>
+                <w:szCs w:val="20"/>
+              </w:rPr>
+            </w:r>
+            <w:r>
+              <w:drawing>
+                <wp:inline xmlns:a="http://schemas.openxmlformats.org/drawingml/2006/main" xmlns:pic="http://schemas.openxmlformats.org/drawingml/2006/picture">
+                  <wp:extent cx="5623560" cy="2576305"/>
+                  <wp:docPr id="9" name="Picture 4" descr="Detalle ampliado de las etapas y el veredicto de la misma captura original."/>
+                  <wp:cNvGraphicFramePr>
+                    <a:graphicFrameLocks noChangeAspect="1"/>
+                  </wp:cNvGraphicFramePr>
+                  <a:graphic>
+                    <a:graphicData uri="http://schemas.openxmlformats.org/drawingml/2006/picture">
+                      <pic:pic>
+                        <pic:nvPicPr>
+                          <pic:cNvPr id="0" name="04_pipeline_verde.png"/>
+                          <pic:cNvPicPr/>
+                        </pic:nvPicPr>
+                        <pic:blipFill>
+                          <a:blip r:embed="rId13"/>
+                          <a:srcRect l="0" t="44500" r="53000" b="3500"/>
+                          <a:stretch>
+                            <a:fillRect/>
+                          </a:stretch>
+                        </pic:blipFill>
+                        <pic:spPr>
+                          <a:xfrm>
+                            <a:off x="0" y="0"/>
+                            <a:ext cx="5623560" cy="2576305"/>
                           </a:xfrm>
                           <a:prstGeom prst="rect"/>
                         </pic:spPr>

</xml_diff>